<commit_message>
I've already finish the examination, I don't think I get the satisfied scores, but anyway, thank u guys. I love u
</commit_message>
<xml_diff>
--- a/learning-text/基础算法.docx
+++ b/learning-text/基础算法.docx
@@ -4938,6 +4938,7 @@
           <w:bCs/>
           <w:sz w:val="21"/>
           <w:szCs w:val="22"/>
+          <w:highlight w:val="green"/>
         </w:rPr>
         <w:t>枚举对象选择能力</w:t>
       </w:r>
@@ -4968,6 +4969,7 @@
           <w:bCs/>
           <w:sz w:val="21"/>
           <w:szCs w:val="22"/>
+          <w:highlight w:val="green"/>
         </w:rPr>
         <w:t>信息维护能力</w:t>
       </w:r>
@@ -4998,6 +5000,7 @@
           <w:bCs/>
           <w:sz w:val="21"/>
           <w:szCs w:val="22"/>
+          <w:highlight w:val="green"/>
         </w:rPr>
         <w:t>单调性识别能力</w:t>
       </w:r>
@@ -5028,6 +5031,7 @@
           <w:bCs/>
           <w:sz w:val="21"/>
           <w:szCs w:val="22"/>
+          <w:highlight w:val="green"/>
         </w:rPr>
         <w:t>贡献统计能力</w:t>
       </w:r>
@@ -5074,6 +5078,7 @@
           <w:bCs/>
           <w:sz w:val="21"/>
           <w:szCs w:val="22"/>
+          <w:highlight w:val="green"/>
         </w:rPr>
         <w:t>边界处理能力</w:t>
       </w:r>
@@ -5233,6 +5238,7 @@
           <w:bCs/>
           <w:sz w:val="21"/>
           <w:szCs w:val="22"/>
+          <w:highlight w:val="green"/>
         </w:rPr>
         <w:t xml:space="preserve">连续子数组 / </w:t>
       </w:r>
@@ -5243,6 +5249,7 @@
           <w:bCs/>
           <w:sz w:val="21"/>
           <w:szCs w:val="22"/>
+          <w:highlight w:val="green"/>
         </w:rPr>
         <w:t>连续子串问题</w:t>
       </w:r>
@@ -5253,6 +5260,7 @@
           <w:bCs/>
           <w:sz w:val="21"/>
           <w:szCs w:val="22"/>
+          <w:highlight w:val="green"/>
         </w:rPr>
         <w:t>。</w:t>
       </w:r>
@@ -5800,18 +5808,72 @@
         <w:snapToGrid w:val="0"/>
         <w:spacing w:after="0" w:line="240" w:lineRule="auto"/>
         <w:rPr>
-          <w:sz w:val="21"/>
-          <w:szCs w:val="22"/>
-        </w:rPr>
-      </w:pPr>
-      <w:r>
-        <w:rPr>
           <w:b/>
           <w:bCs/>
           <w:sz w:val="21"/>
           <w:szCs w:val="22"/>
         </w:rPr>
-        <w:t>每一步都能确定地丢掉一部分不可能的答案。</w:t>
+      </w:pPr>
+      <w:r>
+        <w:rPr>
+          <w:b/>
+          <w:bCs/>
+          <w:sz w:val="21"/>
+          <w:szCs w:val="22"/>
+          <w:highlight w:val="green"/>
+        </w:rPr>
+        <w:t>每一步都能确定地丢掉一部分不可能的答案</w:t>
+      </w:r>
+      <w:r>
+        <w:rPr>
+          <w:b/>
+          <w:bCs/>
+          <w:sz w:val="21"/>
+          <w:szCs w:val="22"/>
+        </w:rPr>
+        <w:t>。</w:t>
+      </w:r>
+    </w:p>
+    <w:p>
+      <w:pPr>
+        <w:snapToGrid w:val="0"/>
+        <w:spacing w:after="0" w:line="240" w:lineRule="auto"/>
+        <w:rPr>
+          <w:sz w:val="21"/>
+          <w:szCs w:val="22"/>
+        </w:rPr>
+      </w:pPr>
+      <w:r>
+        <w:rPr>
+          <w:rFonts w:hint="eastAsia"/>
+          <w:b/>
+          <w:bCs/>
+          <w:sz w:val="21"/>
+          <w:szCs w:val="22"/>
+        </w:rPr>
+        <w:t xml:space="preserve">// </w:t>
+      </w:r>
+      <w:proofErr w:type="gramStart"/>
+      <w:r>
+        <w:rPr>
+          <w:rFonts w:hint="eastAsia"/>
+          <w:b/>
+          <w:bCs/>
+          <w:sz w:val="21"/>
+          <w:szCs w:val="22"/>
+        </w:rPr>
+        <w:t>相向双</w:t>
+      </w:r>
+      <w:proofErr w:type="gramEnd"/>
+      <w:r>
+        <w:rPr>
+          <w:rFonts w:hint="eastAsia"/>
+          <w:b/>
+          <w:bCs/>
+          <w:sz w:val="21"/>
+          <w:szCs w:val="22"/>
+        </w:rPr>
+        <w:t>指针一般都是排序好之后的情况</w:t>
       </w:r>
     </w:p>
     <w:p>
@@ -6558,6 +6620,7 @@
           <w:sz w:val="21"/>
           <w:szCs w:val="22"/>
         </w:rPr>
+        <w:lastRenderedPageBreak/>
         <w:t xml:space="preserve">    }</w:t>
       </w:r>
     </w:p>
@@ -7672,6 +7735,7 @@
           <w:sz w:val="21"/>
           <w:szCs w:val="22"/>
         </w:rPr>
+        <w:lastRenderedPageBreak/>
         <w:t xml:space="preserve">auto </w:t>
       </w:r>
       <w:proofErr w:type="spellStart"/>
@@ -7721,7 +7785,6 @@
           <w:sz w:val="21"/>
           <w:szCs w:val="22"/>
         </w:rPr>
-        <w:lastRenderedPageBreak/>
         <w:t>写一个函数判断字符是不是元音。</w:t>
       </w:r>
     </w:p>
@@ -8833,7 +8896,6 @@
           <w:sz w:val="21"/>
           <w:szCs w:val="22"/>
         </w:rPr>
-        <w:lastRenderedPageBreak/>
         <w:t xml:space="preserve">    while (窗口不合法) {</w:t>
       </w:r>
     </w:p>
@@ -10055,6 +10117,7 @@
           <w:sz w:val="21"/>
           <w:szCs w:val="22"/>
         </w:rPr>
+        <w:lastRenderedPageBreak/>
         <w:t>int left = 0;</w:t>
       </w:r>
     </w:p>
@@ -10072,7 +10135,6 @@
           <w:sz w:val="21"/>
           <w:szCs w:val="22"/>
         </w:rPr>
-        <w:lastRenderedPageBreak/>
         <w:t>left 是窗口左端点。</w:t>
       </w:r>
     </w:p>
@@ -11083,6 +11145,7 @@
           <w:sz w:val="21"/>
           <w:szCs w:val="22"/>
         </w:rPr>
+        <w:lastRenderedPageBreak/>
         <w:t>移动到不能再移动为止，就说明已经找到了当前右端点下的最优左边界。</w:t>
       </w:r>
     </w:p>
@@ -11095,12 +11158,85 @@
           <w:szCs w:val="22"/>
         </w:rPr>
       </w:pPr>
-      <w:r>
-        <w:rPr>
-          <w:sz w:val="21"/>
-          <w:szCs w:val="22"/>
-        </w:rPr>
-        <w:lastRenderedPageBreak/>
+    </w:p>
+    <w:p>
+      <w:pPr>
+        <w:snapToGrid w:val="0"/>
+        <w:spacing w:after="0" w:line="240" w:lineRule="auto"/>
+        <w:rPr>
+          <w:b/>
+          <w:bCs/>
+          <w:sz w:val="21"/>
+          <w:szCs w:val="22"/>
+        </w:rPr>
+      </w:pPr>
+      <w:r>
+        <w:rPr>
+          <w:rFonts w:hint="eastAsia"/>
+          <w:b/>
+          <w:bCs/>
+          <w:sz w:val="21"/>
+          <w:szCs w:val="22"/>
+        </w:rPr>
+        <w:t>// 注意这里双指针不能回退，所以只有在数组元素全为非负数的情况下成立</w:t>
+      </w:r>
+    </w:p>
+    <w:p>
+      <w:pPr>
+        <w:snapToGrid w:val="0"/>
+        <w:spacing w:after="0" w:line="240" w:lineRule="auto"/>
+        <w:rPr>
+          <w:b/>
+          <w:bCs/>
+          <w:sz w:val="21"/>
+          <w:szCs w:val="22"/>
+        </w:rPr>
+      </w:pPr>
+      <w:r>
+        <w:rPr>
+          <w:rFonts w:hint="eastAsia"/>
+          <w:b/>
+          <w:bCs/>
+          <w:sz w:val="21"/>
+          <w:szCs w:val="22"/>
+        </w:rPr>
+        <w:t>// 如果有负数，可以用前缀和+单调队列完成，复杂度仍为N，常数挺大，</w:t>
+      </w:r>
+      <w:r>
+        <w:rPr>
+          <w:rFonts w:hint="eastAsia"/>
+          <w:b/>
+          <w:bCs/>
+          <w:sz w:val="21"/>
+          <w:szCs w:val="22"/>
+        </w:rPr>
+        <w:t>且空间</w:t>
+      </w:r>
+      <w:r>
+        <w:rPr>
+          <w:rFonts w:hint="eastAsia"/>
+          <w:b/>
+          <w:bCs/>
+          <w:sz w:val="21"/>
+          <w:szCs w:val="22"/>
+        </w:rPr>
+        <w:t>换时间</w:t>
+      </w:r>
+    </w:p>
+    <w:p>
+      <w:pPr>
+        <w:snapToGrid w:val="0"/>
+        <w:spacing w:after="0" w:line="240" w:lineRule="auto"/>
+        <w:rPr>
+          <w:sz w:val="21"/>
+          <w:szCs w:val="22"/>
+        </w:rPr>
+      </w:pPr>
+      <w:r>
+        <w:rPr>
+          <w:sz w:val="21"/>
+          <w:szCs w:val="22"/>
+        </w:rPr>
         <w:pict w14:anchorId="0F549A08">
           <v:rect id="_x0000_i1058" style="width:0;height:1.5pt" o:hralign="center" o:hrstd="t" o:hr="t" fillcolor="#a0a0a0" stroked="f"/>
         </w:pict>
@@ -12084,6 +12220,7 @@
           <w:sz w:val="21"/>
           <w:szCs w:val="22"/>
         </w:rPr>
+        <w:lastRenderedPageBreak/>
         <w:t>ans</w:t>
       </w:r>
       <w:proofErr w:type="spellEnd"/>
@@ -12203,7 +12340,6 @@
           <w:sz w:val="21"/>
           <w:szCs w:val="22"/>
         </w:rPr>
-        <w:lastRenderedPageBreak/>
         <w:t>left++;</w:t>
       </w:r>
     </w:p>
@@ -13123,6 +13259,7 @@
           <w:sz w:val="21"/>
           <w:szCs w:val="22"/>
         </w:rPr>
+        <w:lastRenderedPageBreak/>
         <w:t>思考过程</w:t>
       </w:r>
     </w:p>
@@ -13191,7 +13328,6 @@
           <w:sz w:val="21"/>
           <w:szCs w:val="22"/>
         </w:rPr>
-        <w:lastRenderedPageBreak/>
         <w:t>窗口变长，乘积只会变大或不变；</w:t>
       </w:r>
       <w:r>
@@ -14107,6 +14243,7 @@
           <w:sz w:val="21"/>
           <w:szCs w:val="22"/>
         </w:rPr>
+        <w:lastRenderedPageBreak/>
         <w:t>这是核心。</w:t>
       </w:r>
     </w:p>
@@ -14181,7 +14318,6 @@
           <w:sz w:val="21"/>
           <w:szCs w:val="22"/>
         </w:rPr>
-        <w:lastRenderedPageBreak/>
         <w:t>题单也特别提到，这类一般写：</w:t>
       </w:r>
     </w:p>
@@ -15094,6 +15230,7 @@
           <w:sz w:val="21"/>
           <w:szCs w:val="22"/>
         </w:rPr>
+        <w:lastRenderedPageBreak/>
         <w:t>代码</w:t>
       </w:r>
     </w:p>
@@ -15187,7 +15324,6 @@
           <w:sz w:val="21"/>
           <w:szCs w:val="22"/>
         </w:rPr>
-        <w:lastRenderedPageBreak/>
         <w:t xml:space="preserve">        vector&lt;int&gt; </w:t>
       </w:r>
       <w:proofErr w:type="spellStart"/>
@@ -16338,6 +16474,7 @@
               <w:rPr>
                 <w:sz w:val="21"/>
                 <w:szCs w:val="22"/>
+                <w:highlight w:val="green"/>
               </w:rPr>
             </w:pPr>
             <w:proofErr w:type="gramStart"/>
@@ -16345,6 +16482,7 @@
               <w:rPr>
                 <w:sz w:val="21"/>
                 <w:szCs w:val="22"/>
+                <w:highlight w:val="green"/>
               </w:rPr>
               <w:t>越短越合法</w:t>
             </w:r>
@@ -16364,12 +16502,14 @@
               <w:rPr>
                 <w:sz w:val="21"/>
                 <w:szCs w:val="22"/>
+                <w:highlight w:val="green"/>
               </w:rPr>
             </w:pPr>
             <w:r>
               <w:rPr>
                 <w:sz w:val="21"/>
                 <w:szCs w:val="22"/>
+                <w:highlight w:val="green"/>
               </w:rPr>
               <w:t>当前窗口合法</w:t>
             </w:r>
@@ -16388,12 +16528,14 @@
               <w:rPr>
                 <w:sz w:val="21"/>
                 <w:szCs w:val="22"/>
+                <w:highlight w:val="green"/>
               </w:rPr>
             </w:pPr>
             <w:r>
               <w:rPr>
                 <w:sz w:val="21"/>
                 <w:szCs w:val="22"/>
+                <w:highlight w:val="green"/>
               </w:rPr>
               <w:t>right - left + 1</w:t>
             </w:r>
@@ -16417,12 +16559,14 @@
               <w:rPr>
                 <w:sz w:val="21"/>
                 <w:szCs w:val="22"/>
+                <w:highlight w:val="green"/>
               </w:rPr>
             </w:pPr>
             <w:r>
               <w:rPr>
                 <w:sz w:val="21"/>
                 <w:szCs w:val="22"/>
+                <w:highlight w:val="green"/>
               </w:rPr>
               <w:t>越长越合法</w:t>
             </w:r>
@@ -16441,12 +16585,14 @@
               <w:rPr>
                 <w:sz w:val="21"/>
                 <w:szCs w:val="22"/>
+                <w:highlight w:val="green"/>
               </w:rPr>
             </w:pPr>
             <w:r>
               <w:rPr>
                 <w:sz w:val="21"/>
                 <w:szCs w:val="22"/>
+                <w:highlight w:val="green"/>
               </w:rPr>
               <w:t>当前窗口不合法</w:t>
             </w:r>
@@ -16465,12 +16611,14 @@
               <w:rPr>
                 <w:sz w:val="21"/>
                 <w:szCs w:val="22"/>
+                <w:highlight w:val="green"/>
               </w:rPr>
             </w:pPr>
             <w:r>
               <w:rPr>
                 <w:sz w:val="21"/>
                 <w:szCs w:val="22"/>
+                <w:highlight w:val="green"/>
               </w:rPr>
               <w:t>left</w:t>
             </w:r>
@@ -16531,8 +16679,25 @@
         <w:rPr>
           <w:sz w:val="21"/>
           <w:szCs w:val="22"/>
-        </w:rPr>
-        <w:t>题单也提到，“恰好”可以拆成两个“至少”，或者两个“至多”。比如恰好等于 k，可以用 &gt;= k 减去 &gt;= k + 1，也可以用 &lt;= k 减去 &lt;= k - 1。(</w:t>
+          <w:highlight w:val="green"/>
+        </w:rPr>
+        <w:t xml:space="preserve">题单也提到，“恰好”可以拆成两个“至少”，或者两个“至多”。比如恰好等于 k，可以用 &gt;= </w:t>
+      </w:r>
+      <w:r>
+        <w:rPr>
+          <w:sz w:val="21"/>
+          <w:szCs w:val="22"/>
+          <w:highlight w:val="green"/>
+        </w:rPr>
+        <w:lastRenderedPageBreak/>
+        <w:t>k 减去 &gt;= k + 1，也可以用 &lt;= k 减去 &lt;= k - 1</w:t>
+      </w:r>
+      <w:r>
+        <w:rPr>
+          <w:sz w:val="21"/>
+          <w:szCs w:val="22"/>
+        </w:rPr>
+        <w:t>。(</w:t>
       </w:r>
       <w:hyperlink r:id="rId15" w:tooltip="分享丨〖算法题单〗滑动窗口与双指针（定长/不定长/单序列/双序列/三指针/分组循环） - 讨论 - 力扣（LeetCode）" w:history="1">
         <w:proofErr w:type="gramStart"/>
@@ -16631,13 +16796,6 @@
           <w:szCs w:val="22"/>
         </w:rPr>
         <w:br/>
-      </w:r>
-      <w:r>
-        <w:rPr>
-          <w:sz w:val="21"/>
-          <w:szCs w:val="22"/>
-        </w:rPr>
-        <w:lastRenderedPageBreak/>
         <w:t xml:space="preserve">正好 k </w:t>
       </w:r>
       <w:proofErr w:type="gramStart"/>
@@ -17802,6 +17960,7 @@
           <w:sz w:val="21"/>
           <w:szCs w:val="22"/>
         </w:rPr>
+        <w:lastRenderedPageBreak/>
         <w:t xml:space="preserve">            if (</w:t>
       </w:r>
       <w:proofErr w:type="spellStart"/>
@@ -17879,7 +18038,6 @@
           <w:sz w:val="21"/>
           <w:szCs w:val="22"/>
         </w:rPr>
-        <w:lastRenderedPageBreak/>
         <w:t xml:space="preserve">            while (odd &gt; k) {</w:t>
       </w:r>
     </w:p>
@@ -19001,6 +19159,13 @@
           <w:szCs w:val="22"/>
         </w:rPr>
         <w:br/>
+      </w:r>
+      <w:r>
+        <w:rPr>
+          <w:sz w:val="21"/>
+          <w:szCs w:val="22"/>
+        </w:rPr>
+        <w:lastRenderedPageBreak/>
         <w:t>回文判断</w:t>
       </w:r>
       <w:r>
@@ -19033,13 +19198,6 @@
           <w:szCs w:val="22"/>
         </w:rPr>
         <w:br/>
-      </w:r>
-      <w:r>
-        <w:rPr>
-          <w:sz w:val="21"/>
-          <w:szCs w:val="22"/>
-        </w:rPr>
-        <w:lastRenderedPageBreak/>
         <w:t>从两端选择</w:t>
       </w:r>
       <w:r>
@@ -19883,6 +20041,7 @@
           <w:sz w:val="21"/>
           <w:szCs w:val="22"/>
         </w:rPr>
+        <w:lastRenderedPageBreak/>
         <w:t xml:space="preserve">        }</w:t>
       </w:r>
     </w:p>
@@ -19944,7 +20103,6 @@
           <w:sz w:val="21"/>
           <w:szCs w:val="22"/>
         </w:rPr>
-        <w:lastRenderedPageBreak/>
         <w:t>};</w:t>
       </w:r>
     </w:p>
@@ -20840,6 +20998,7 @@
           <w:sz w:val="21"/>
           <w:szCs w:val="22"/>
         </w:rPr>
+        <w:lastRenderedPageBreak/>
         <w:t xml:space="preserve">        </w:t>
       </w:r>
       <w:proofErr w:type="spellStart"/>
@@ -20931,7 +21090,6 @@
           <w:sz w:val="21"/>
           <w:szCs w:val="22"/>
         </w:rPr>
-        <w:lastRenderedPageBreak/>
         <w:pict w14:anchorId="444803FF">
           <v:rect id="_x0000_i1093" style="width:0;height:1.5pt" o:hralign="center" o:hrstd="t" o:hr="t" fillcolor="#a0a0a0" stroked="f"/>
         </w:pict>
@@ -22022,6 +22180,7 @@
           <w:sz w:val="21"/>
           <w:szCs w:val="22"/>
         </w:rPr>
+        <w:lastRenderedPageBreak/>
         <w:t>看到两个数组、两个字符串，并且你需要：</w:t>
       </w:r>
     </w:p>
@@ -22063,13 +22222,6 @@
           <w:szCs w:val="22"/>
         </w:rPr>
         <w:br/>
-      </w:r>
-      <w:r>
-        <w:rPr>
-          <w:sz w:val="21"/>
-          <w:szCs w:val="22"/>
-        </w:rPr>
-        <w:lastRenderedPageBreak/>
         <w:t>判断一个是不是另一个的子序列</w:t>
       </w:r>
       <w:r>
@@ -23211,6 +23363,7 @@
           <w:sz w:val="21"/>
           <w:szCs w:val="22"/>
         </w:rPr>
+        <w:lastRenderedPageBreak/>
         <w:pict w14:anchorId="1A2CD4A5">
           <v:rect id="_x0000_i1102" style="width:0;height:1.5pt" o:hralign="center" o:hrstd="t" o:hr="t" fillcolor="#a0a0a0" stroked="f"/>
         </w:pict>
@@ -23292,7 +23445,6 @@
           <w:sz w:val="21"/>
           <w:szCs w:val="22"/>
         </w:rPr>
-        <w:lastRenderedPageBreak/>
         <w:t xml:space="preserve">return </w:t>
       </w:r>
       <w:proofErr w:type="spellStart"/>
@@ -24216,6 +24368,7 @@
           <w:sz w:val="21"/>
           <w:szCs w:val="22"/>
         </w:rPr>
+        <w:lastRenderedPageBreak/>
         <w:t xml:space="preserve">    int </w:t>
       </w:r>
       <w:proofErr w:type="spellStart"/>
@@ -24336,7 +24489,6 @@
           <w:sz w:val="21"/>
           <w:szCs w:val="22"/>
         </w:rPr>
-        <w:lastRenderedPageBreak/>
         <w:t>因为它天然处理了最后一组。</w:t>
       </w:r>
     </w:p>
@@ -25452,6 +25604,7 @@
           <w:sz w:val="21"/>
           <w:szCs w:val="22"/>
         </w:rPr>
+        <w:lastRenderedPageBreak/>
         <w:t xml:space="preserve">int value = </w:t>
       </w:r>
       <w:proofErr w:type="spellStart"/>
@@ -25602,7 +25755,6 @@
           <w:sz w:val="21"/>
           <w:szCs w:val="22"/>
         </w:rPr>
-        <w:lastRenderedPageBreak/>
         <w:t>一直往后走，直到这一组结束。</w:t>
       </w:r>
     </w:p>
@@ -26532,6 +26684,7 @@
           <w:sz w:val="21"/>
           <w:szCs w:val="22"/>
         </w:rPr>
+        <w:lastRenderedPageBreak/>
         <w:t>常见写法：</w:t>
       </w:r>
     </w:p>
@@ -26600,7 +26753,6 @@
           <w:sz w:val="21"/>
           <w:szCs w:val="22"/>
         </w:rPr>
-        <w:lastRenderedPageBreak/>
         <w:t>}</w:t>
       </w:r>
     </w:p>
@@ -27556,6 +27708,7 @@
           <w:sz w:val="21"/>
           <w:szCs w:val="22"/>
         </w:rPr>
+        <w:lastRenderedPageBreak/>
         <w:t>第二组：</w:t>
       </w:r>
       <w:proofErr w:type="gramStart"/>
@@ -27662,7 +27815,6 @@
           <w:sz w:val="21"/>
           <w:szCs w:val="22"/>
         </w:rPr>
-        <w:lastRenderedPageBreak/>
         <w:t>水果成篮</w:t>
       </w:r>
     </w:p>
@@ -28589,6 +28741,7 @@
           <w:sz w:val="21"/>
           <w:szCs w:val="22"/>
         </w:rPr>
+        <w:lastRenderedPageBreak/>
         <w:t>第六组：三指针 / 最近位置</w:t>
       </w:r>
     </w:p>
@@ -28659,7 +28812,6 @@
           <w:sz w:val="21"/>
           <w:szCs w:val="22"/>
         </w:rPr>
-        <w:lastRenderedPageBreak/>
         <w:t>区间子数组个数</w:t>
       </w:r>
     </w:p>

</xml_diff>